<commit_message>
Thuc hien toan bo ghi chu boi do trong ban Word tuan 5/10-10/10
- NC1: bo muc 2.6 cong tac hanh trinh, doi so chuong 2; 3 phuong phap bo chu Nhom;
  3.4 thanh muc tham khao (+tai lieu Mousazadeh 2009); 3.6 viet kieu tran thuat;
  4.1 giu viec that, ma tran chuyen sang 4.2 viec tiep theo
- NC2: chuong 2.9 chep theo do an 1; chuong 3 viet khac di, ghi chu tham khao;
  3.5 thay bang luu do 4 LDR cua sinh vien; xoa 3.6; 4.1 viet lai viec that
- CT2: 2.7 chep theo do an 1; 3.5 thuan co khi + ga cong tac hanh trinh;
  3.6 danh muc chi tiet co khi; 3.7 quy trinh lap rap co khi du kien; 4.1 SolidWorks
- LT1: xoa 3.1-3.4 (chuyen ben che tao); code day du xuong Phu luc A, muc 3.7 chi
  con cac ham tung khoi; luu do tong quat dat truoc code; 4.1/4.2 ghi dung thuc te
- Ve lai 7 luu do (chuc nang khoi, co Khoi tao va Ket thuc); PDF dung truc tiep
  tu Word bang tools/xuat_pdf_tu_docx.py

Co-authored-by: arena-agent <297053741+arena-agent@users.noreply.github.com>
</commit_message>
<xml_diff>
--- a/Bao_cao_2_truc_Lap_trinh.docx
+++ b/Bao_cao_2_truc_Lap_trinh.docx
@@ -2452,7 +2452,7 @@
       <w:r>
         <w:drawing>
           <wp:inline xmlns:a="http://schemas.openxmlformats.org/drawingml/2006/main" xmlns:pic="http://schemas.openxmlformats.org/drawingml/2006/picture">
-            <wp:extent cx="5400000" cy="7546065"/>
+            <wp:extent cx="5669280" cy="7138490"/>
             <wp:docPr id="1" name="Picture 1"/>
             <wp:cNvGraphicFramePr>
               <a:graphicFrameLocks noChangeAspect="1"/>
@@ -2473,7 +2473,7 @@
                   <pic:spPr>
                     <a:xfrm>
                       <a:off x="0" y="0"/>
-                      <a:ext cx="5400000" cy="7546065"/>
+                      <a:ext cx="5669280" cy="7138490"/>
                     </a:xfrm>
                     <a:prstGeom prst="rect"/>
                   </pic:spPr>
@@ -2500,7 +2500,7 @@
       <w:r>
         <w:drawing>
           <wp:inline xmlns:a="http://schemas.openxmlformats.org/drawingml/2006/main" xmlns:pic="http://schemas.openxmlformats.org/drawingml/2006/picture">
-            <wp:extent cx="3780000" cy="4947034"/>
+            <wp:extent cx="5120640" cy="5965459"/>
             <wp:docPr id="2" name="Picture 2"/>
             <wp:cNvGraphicFramePr>
               <a:graphicFrameLocks noChangeAspect="1"/>
@@ -2521,7 +2521,7 @@
                   <pic:spPr>
                     <a:xfrm>
                       <a:off x="0" y="0"/>
-                      <a:ext cx="3780000" cy="4947034"/>
+                      <a:ext cx="5120640" cy="5965459"/>
                     </a:xfrm>
                     <a:prstGeom prst="rect"/>
                   </pic:spPr>
@@ -2548,7 +2548,7 @@
       <w:r>
         <w:drawing>
           <wp:inline xmlns:a="http://schemas.openxmlformats.org/drawingml/2006/main" xmlns:pic="http://schemas.openxmlformats.org/drawingml/2006/picture">
-            <wp:extent cx="5400000" cy="6831232"/>
+            <wp:extent cx="5120640" cy="6426925"/>
             <wp:docPr id="3" name="Picture 3"/>
             <wp:cNvGraphicFramePr>
               <a:graphicFrameLocks noChangeAspect="1"/>
@@ -2569,7 +2569,7 @@
                   <pic:spPr>
                     <a:xfrm>
                       <a:off x="0" y="0"/>
-                      <a:ext cx="5400000" cy="6831232"/>
+                      <a:ext cx="5120640" cy="6426925"/>
                     </a:xfrm>
                     <a:prstGeom prst="rect"/>
                   </pic:spPr>
@@ -2596,7 +2596,7 @@
       <w:r>
         <w:drawing>
           <wp:inline xmlns:a="http://schemas.openxmlformats.org/drawingml/2006/main" xmlns:pic="http://schemas.openxmlformats.org/drawingml/2006/picture">
-            <wp:extent cx="5400000" cy="7030974"/>
+            <wp:extent cx="5120640" cy="6233283"/>
             <wp:docPr id="4" name="Picture 4"/>
             <wp:cNvGraphicFramePr>
               <a:graphicFrameLocks noChangeAspect="1"/>
@@ -2617,7 +2617,7 @@
                   <pic:spPr>
                     <a:xfrm>
                       <a:off x="0" y="0"/>
-                      <a:ext cx="5400000" cy="7030974"/>
+                      <a:ext cx="5120640" cy="6233283"/>
                     </a:xfrm>
                     <a:prstGeom prst="rect"/>
                   </pic:spPr>
@@ -2644,7 +2644,7 @@
       <w:r>
         <w:drawing>
           <wp:inline xmlns:a="http://schemas.openxmlformats.org/drawingml/2006/main" xmlns:pic="http://schemas.openxmlformats.org/drawingml/2006/picture">
-            <wp:extent cx="5400000" cy="6131868"/>
+            <wp:extent cx="4937760" cy="5164493"/>
             <wp:docPr id="5" name="Picture 5"/>
             <wp:cNvGraphicFramePr>
               <a:graphicFrameLocks noChangeAspect="1"/>
@@ -2665,7 +2665,7 @@
                   <pic:spPr>
                     <a:xfrm>
                       <a:off x="0" y="0"/>
-                      <a:ext cx="5400000" cy="6131868"/>
+                      <a:ext cx="4937760" cy="5164493"/>
                     </a:xfrm>
                     <a:prstGeom prst="rect"/>
                   </pic:spPr>
@@ -2692,7 +2692,7 @@
       <w:r>
         <w:drawing>
           <wp:inline xmlns:a="http://schemas.openxmlformats.org/drawingml/2006/main" xmlns:pic="http://schemas.openxmlformats.org/drawingml/2006/picture">
-            <wp:extent cx="5400000" cy="6254505"/>
+            <wp:extent cx="4937760" cy="5680943"/>
             <wp:docPr id="6" name="Picture 6"/>
             <wp:cNvGraphicFramePr>
               <a:graphicFrameLocks noChangeAspect="1"/>
@@ -2713,7 +2713,7 @@
                   <pic:spPr>
                     <a:xfrm>
                       <a:off x="0" y="0"/>
-                      <a:ext cx="5400000" cy="6254505"/>
+                      <a:ext cx="4937760" cy="5680943"/>
                     </a:xfrm>
                     <a:prstGeom prst="rect"/>
                   </pic:spPr>

</xml_diff>